<commit_message>
Agregar muestras, datos originales y corregir documento
</commit_message>
<xml_diff>
--- a/docs/entregas/Entrega1_Estrategia_y_Diagnostico.docx
+++ b/docs/entregas/Entrega1_Estrategia_y_Diagnostico.docx
@@ -530,7 +530,7 @@
           <w:sz w:val="20"/>
           <w:szCs w:val="20"/>
         </w:rPr>
-        <w:t>de Movilidad (SDM) de Bogotá D.C., orientada a resolver la alta siniestralidad vial (1.363 fallecidos y</w:t>
+        <w:t>de Movilidad (SDM) de Bogotá D.C., orientada a resolver la alta siniestralidad vial (1.363 siniestros con muertos y</w:t>
       </w:r>
     </w:p>
     <w:p>
@@ -553,7 +553,7 @@
           <w:sz w:val="20"/>
           <w:szCs w:val="20"/>
         </w:rPr>
-        <w:t>31.527 heridos en 2018–2020) y optimizar el funcionamiento de la red semafórica frente al crecimiento</w:t>
+        <w:t>31.527 con heridos en 2018–2020) y optimizar el funcionamiento de la red semafórica frente al crecimiento</w:t>
       </w:r>
     </w:p>
     <w:p>
@@ -1783,7 +1783,7 @@
                 <w:sz w:val="20"/>
                 <w:szCs w:val="20"/>
               </w:rPr>
-              <w:t xml:space="preserve">El archivo de siniestros presenta valores vacíos en PK_CALZADA (18,88 %, 16.765 de 88.804 registros) y en CIV (0,33 %). Además, FECHA_OCURRENCIA_ACC y FECHA_HORA_ACC llegan con sufijo de zona horaria (por ejemplo, 2020/11/19 02:05:00+00), por lo que deben normalizarse a la hora local de Bogotá antes de derivar el día y la franja horaria. En la red semafórica, GRUPOS_BRT está vacío en 103 de 106 registros (97,17 %) y GRUPOSSONOROS en 26 (24,53 %).</w:t>
+              <w:t xml:space="preserve">El archivo de siniestros presenta valores vacíos en PK_CALZADA (18,88 %, 16.765 de 88.804 registros) y en CIV (0,33 %). Además, las dos columnas de fecha llegan como texto con sufijo de zona horaria +00 (por ejemplo, 2020/11/19 02:05:00+00) y FECHA_OCURRENCIA_ACC repite la fecha de FECHA_HORA_ACC con la hora en 00:00:00, por lo que hay que limpiar el formato y derivar la franja horaria solo de FECHA_HORA_ACC. En la red semafórica, GRUPOS_BRT está vacío en 103 de 106 registros (97,17 %) y GRUPOSSONOROS en 26 (24,53 %).</w:t>
             </w:r>
           </w:p>
         </w:tc>
@@ -8209,7 +8209,7 @@
           </w:tcPr>
           <w:p>
             <w:r>
-              <w:t xml:space="preserve">Vehículo (combustible, clase, carrocería), Tiempo (año, dimensión compartida entre ambos hechos)</w:t>
+              <w:t xml:space="preserve">Vehículo (combustible, clase, carrocería; filtro municipio = Bogotá), Tiempo (año, dimensión compartida entre ambos hechos)</w:t>
             </w:r>
           </w:p>
         </w:tc>

</xml_diff>